<commit_message>
Update Shashroy Bazar final report document
</commit_message>
<xml_diff>
--- a/Project/Shashroy_Bazar_Final_Report.docx
+++ b/Project/Shashroy_Bazar_Final_Report.docx
@@ -1355,162 +1355,39 @@
       </w:r>
     </w:p>
     <w:p>
-      <w:pPr>
-        <w:pStyle w:val="ListParagraph"/>
-        <w:numPr>
-          <w:ilvl w:val="0"/>
-          <w:numId w:val="9"/>
-        </w:numPr>
-        <w:rPr>
-          <w:rFonts w:ascii="Times New Roman" w:hAnsi="Times New Roman" w:cs="Times New Roman"/>
-          <w:iCs/>
-        </w:rPr>
-      </w:pPr>
-      <w:r>
-        <w:rPr>
-          <w:rFonts w:ascii="Times New Roman" w:hAnsi="Times New Roman" w:cs="Times New Roman"/>
-          <w:iCs/>
-        </w:rPr>
-        <w:t>W</w:t>
-      </w:r>
-      <w:r>
-        <w:rPr>
-          <w:rFonts w:ascii="Times New Roman" w:hAnsi="Times New Roman" w:cs="Times New Roman"/>
-          <w:iCs/>
-        </w:rPr>
-        <w:t>hat are the solutions you are going to propose to deal with the</w:t>
-      </w:r>
-      <w:r>
-        <w:rPr>
-          <w:rFonts w:ascii="Times New Roman" w:hAnsi="Times New Roman" w:cs="Times New Roman"/>
-          <w:iCs/>
-        </w:rPr>
-        <w:t xml:space="preserve"> problem? why is this </w:t>
-      </w:r>
-      <w:r>
-        <w:rPr>
-          <w:rFonts w:ascii="Times New Roman" w:hAnsi="Times New Roman" w:cs="Times New Roman"/>
-          <w:iCs/>
-        </w:rPr>
-        <w:br/>
-      </w:r>
-      <w:r>
-        <w:rPr>
-          <w:rFonts w:ascii="Times New Roman" w:hAnsi="Times New Roman" w:cs="Times New Roman"/>
-          <w:iCs/>
-        </w:rPr>
-        <w:t xml:space="preserve">solution is </w:t>
-      </w:r>
-      <w:r>
-        <w:rPr>
-          <w:rFonts w:ascii="Times New Roman" w:hAnsi="Times New Roman" w:cs="Times New Roman"/>
-          <w:iCs/>
-        </w:rPr>
-        <w:t xml:space="preserve">particularly </w:t>
-      </w:r>
-      <w:r>
-        <w:rPr>
-          <w:rFonts w:ascii="Times New Roman" w:hAnsi="Times New Roman" w:cs="Times New Roman"/>
-          <w:iCs/>
-        </w:rPr>
-        <w:t>appropriate to solve the problem?</w:t>
-      </w:r>
-      <w:r>
-        <w:rPr>
-          <w:rFonts w:ascii="Times New Roman" w:hAnsi="Times New Roman" w:cs="Times New Roman"/>
-          <w:iCs/>
-        </w:rPr>
-        <w:t xml:space="preserve"> Is the solution feasible to the </w:t>
-      </w:r>
-      <w:r>
-        <w:rPr>
-          <w:rFonts w:ascii="Times New Roman" w:hAnsi="Times New Roman" w:cs="Times New Roman"/>
-          <w:iCs/>
-        </w:rPr>
-        <w:br/>
-      </w:r>
-      <w:r>
-        <w:rPr>
-          <w:rFonts w:ascii="Times New Roman" w:hAnsi="Times New Roman" w:cs="Times New Roman"/>
-          <w:iCs/>
-        </w:rPr>
-        <w:t xml:space="preserve">meet the </w:t>
-      </w:r>
-      <w:r>
-        <w:rPr>
-          <w:rFonts w:ascii="Times New Roman" w:hAnsi="Times New Roman" w:cs="Times New Roman"/>
-          <w:iCs/>
-        </w:rPr>
-        <w:t>business objective</w:t>
-      </w:r>
-      <w:r>
-        <w:rPr>
-          <w:rFonts w:ascii="Times New Roman" w:hAnsi="Times New Roman" w:cs="Times New Roman"/>
-          <w:iCs/>
-        </w:rPr>
-        <w:t>?</w:t>
-      </w:r>
-    </w:p>
-    <w:p>
-      <w:pPr>
-        <w:pStyle w:val="ListParagraph"/>
-        <w:numPr>
-          <w:ilvl w:val="0"/>
-          <w:numId w:val="9"/>
-        </w:numPr>
-        <w:rPr>
-          <w:rFonts w:ascii="Times New Roman" w:hAnsi="Times New Roman" w:cs="Times New Roman"/>
-          <w:iCs/>
-        </w:rPr>
-      </w:pPr>
-      <w:r>
-        <w:rPr>
-          <w:rFonts w:ascii="Times New Roman" w:hAnsi="Times New Roman" w:cs="Times New Roman"/>
-          <w:iCs/>
-        </w:rPr>
-        <w:t>Provide a short description of the software being specified and its purpose, including relevant benefits, objectives, and goals</w:t>
-      </w:r>
-    </w:p>
-    <w:p>
-      <w:pPr>
-        <w:pStyle w:val="ListParagraph"/>
-        <w:numPr>
-          <w:ilvl w:val="0"/>
-          <w:numId w:val="9"/>
-        </w:numPr>
-        <w:rPr>
-          <w:rFonts w:ascii="Times New Roman" w:hAnsi="Times New Roman" w:cs="Times New Roman"/>
-          <w:iCs/>
-        </w:rPr>
-      </w:pPr>
-      <w:r>
-        <w:rPr>
-          <w:rFonts w:ascii="Times New Roman" w:hAnsi="Times New Roman" w:cs="Times New Roman"/>
-          <w:iCs/>
-        </w:rPr>
-        <w:t xml:space="preserve">Existing studies presented in the problem area. What are the existing software solutions   </w:t>
-      </w:r>
-      <w:r>
-        <w:rPr>
-          <w:rFonts w:ascii="Times New Roman" w:hAnsi="Times New Roman" w:cs="Times New Roman"/>
-          <w:iCs/>
-        </w:rPr>
-        <w:br/>
-        <w:t xml:space="preserve">  are available to solve the </w:t>
-      </w:r>
-      <w:r>
-        <w:rPr>
-          <w:rFonts w:ascii="Times New Roman" w:hAnsi="Times New Roman" w:cs="Times New Roman"/>
-          <w:iCs/>
-        </w:rPr>
-        <w:t>problem</w:t>
-      </w:r>
-      <w:r>
-        <w:rPr>
-          <w:rFonts w:ascii="Times New Roman" w:hAnsi="Times New Roman" w:cs="Times New Roman"/>
-          <w:iCs/>
-        </w:rPr>
-        <w:t>?</w:t>
+      <w:r>
+        <w:rPr>
+          <w:rFonts w:ascii="Times New Roman" w:hAnsi="Times New Roman"/>
+          <w:sz w:val="24"/>
+        </w:rPr>
+        <w:t>Shashroy Bazar (সাশ্রয় বাজার) is proposed as a zone-based surplus food and medicine marketplace and redistribution platform that connects verified sellers of near-expiry, safe-to-consume surplus stock with two groups of buyers: price-conscious customers who purchase the surplus at a steep, system-controlled discount, and NGOs, shelters and low-income households who receive eligible surplus as verified donations. Every user and merchant completes mobile-OTP and eKYC identity verification before they can transact, and every listing carries a mandatory expiry-date photograph, so that both sides of a transaction can trust who they are dealing with and what condition the product is in — the two guarantees that informal donation and clearance channels (word-of-mouth networks, unmoderated social media groups, ad hoc merchant clearance sales) cannot currently offer.</w:t>
+      </w:r>
+    </w:p>
+    <w:p>
+      <w:r>
+        <w:rPr>
+          <w:rFonts w:ascii="Times New Roman" w:hAnsi="Times New Roman"/>
+          <w:sz w:val="24"/>
+        </w:rPr>
+        <w:t>The solution is deliberately scoped to be zone-based rather than city-wide: a customer only sees listings available within their own selected zone, which keeps pickup and delivery practical (no delivery fee is charged to the customer) and lets the platform launch and prove itself in a single pilot area before expanding. Pricing is not left to individual merchants — the system benchmarks every discounted listing against a market-price reference and enforces a configured discount band, so the core promise of a trustworthy discount is a platform guarantee rather than a merchant's marketing claim. To prevent the platform from being emptied by bulk buyers rather than the households it is meant to serve, purchase quantities are capped and monitored per user.</w:t>
+      </w:r>
+    </w:p>
+    <w:p>
+      <w:r>
+        <w:rPr>
+          <w:rFonts w:ascii="Times New Roman" w:hAnsi="Times New Roman"/>
+          <w:sz w:val="24"/>
+        </w:rPr>
+        <w:t>This solution is feasible within the constraints of a small, 7-person, 8-month build (see Section 4, Development Plan) because it is built largely on integration rather than invention: identity verification, OTP/SMS, and payment (bKash/Nagad) are provided by established third-party services behind a swappable interface, and engineering effort is concentrated on what is genuinely specific to this problem — the expiry-aware listing and pricing rules, the zone-scoped catalog, and the donation-allocation workflow. Revenue comes from advertising by verified NGOs and organizations rather than a customer-facing service fee, keeping the "save money or give safely" promise to customers and donors intact.</w:t>
+      </w:r>
+    </w:p>
+    <w:p>
+      <w:r>
+        <w:rPr>
+          <w:rFonts w:ascii="Times New Roman" w:hAnsi="Times New Roman"/>
+          <w:sz w:val="24"/>
+        </w:rPr>
+        <w:t>Existing efforts in this space are largely informal: individual restaurants posting last-minute discounts on social media, NGO donation drives coordinated by phone and word of mouth, and general-purpose marketplace or classifieds apps that carry no notion of expiry, no identity verification, and no donation-specific workflow at all. None of these existing channels combine verified identity, an expiry-aware listing model, system-enforced discount pricing, and a first-class donation path in one product — which is the specific gap Shashroy Bazar is designed to fill.</w:t>
       </w:r>
     </w:p>
     <w:p>
@@ -1582,30 +1459,728 @@
       </w:r>
     </w:p>
     <w:p>
-      <w:pPr>
-        <w:pStyle w:val="ListParagraph"/>
-        <w:numPr>
-          <w:ilvl w:val="0"/>
-          <w:numId w:val="1"/>
-        </w:numPr>
-        <w:rPr>
-          <w:rFonts w:ascii="Times New Roman" w:hAnsi="Times New Roman" w:cs="Times New Roman"/>
-          <w:bCs/>
-        </w:rPr>
-      </w:pPr>
-      <w:r>
-        <w:rPr>
-          <w:rFonts w:ascii="Times New Roman" w:hAnsi="Times New Roman" w:cs="Times New Roman"/>
-          <w:bCs/>
-        </w:rPr>
-        <w:t>List down the system functional requirements and quality attributes in each system feature that is necessary for the software</w:t>
-      </w:r>
-      <w:r>
-        <w:rPr>
-          <w:rFonts w:ascii="Times New Roman" w:hAnsi="Times New Roman" w:cs="Times New Roman"/>
-          <w:bCs/>
-        </w:rPr>
-        <w:t>.</w:t>
+      <w:r>
+        <w:rPr>
+          <w:rFonts w:ascii="Times New Roman" w:hAnsi="Times New Roman"/>
+          <w:sz w:val="24"/>
+        </w:rPr>
+        <w:t>The full functional specification lives in the project's Software Requirements Specification (SRS v1.0, FR-01–FR-73). The features below condense that specification into the fourteen functional areas it defines; each area cites its FR range for traceability back to the full SRS.</w:t>
+      </w:r>
+    </w:p>
+    <w:p>
+      <w:r>
+        <w:rPr>
+          <w:rFonts w:ascii="Times New Roman" w:hAnsi="Times New Roman"/>
+          <w:b/>
+          <w:sz w:val="24"/>
+        </w:rPr>
+        <w:t>Registration, Authentication and eKYC (FR-01–FR-05)</w:t>
+      </w:r>
+    </w:p>
+    <w:p>
+      <w:pPr>
+        <w:pStyle w:val="ListParagraph"/>
+        <w:numPr>
+          <w:ilvl w:val="0"/>
+          <w:numId w:val="8"/>
+        </w:numPr>
+      </w:pPr>
+      <w:r>
+        <w:rPr>
+          <w:rFonts w:ascii="Times New Roman" w:hAnsi="Times New Roman"/>
+          <w:sz w:val="24"/>
+        </w:rPr>
+        <w:t>Users register and verify their identity via mobile OTP and eKYC (NID-based document verification), including duplicate-identity checks and manual review where needed.</w:t>
+      </w:r>
+    </w:p>
+    <w:p>
+      <w:pPr>
+        <w:pStyle w:val="ListParagraph"/>
+        <w:numPr>
+          <w:ilvl w:val="0"/>
+          <w:numId w:val="8"/>
+        </w:numPr>
+      </w:pPr>
+      <w:r>
+        <w:rPr>
+          <w:rFonts w:ascii="Times New Roman" w:hAnsi="Times New Roman"/>
+          <w:sz w:val="24"/>
+        </w:rPr>
+        <w:t>Verification status is tracked and shown to the applicant throughout the review process.</w:t>
+      </w:r>
+    </w:p>
+    <w:p>
+      <w:pPr>
+        <w:pStyle w:val="ListParagraph"/>
+        <w:numPr>
+          <w:ilvl w:val="0"/>
+          <w:numId w:val="8"/>
+        </w:numPr>
+      </w:pPr>
+      <w:r>
+        <w:rPr>
+          <w:rFonts w:ascii="Times New Roman" w:hAnsi="Times New Roman"/>
+          <w:sz w:val="24"/>
+        </w:rPr>
+        <w:t>Secure login and session authentication is required for every verified account.</w:t>
+      </w:r>
+    </w:p>
+    <w:p>
+      <w:r>
+        <w:rPr>
+          <w:rFonts w:ascii="Times New Roman" w:hAnsi="Times New Roman"/>
+          <w:b/>
+          <w:sz w:val="24"/>
+        </w:rPr>
+        <w:t>Zone-Based Access (FR-06–FR-09)</w:t>
+      </w:r>
+    </w:p>
+    <w:p>
+      <w:pPr>
+        <w:pStyle w:val="ListParagraph"/>
+        <w:numPr>
+          <w:ilvl w:val="0"/>
+          <w:numId w:val="8"/>
+        </w:numPr>
+      </w:pPr>
+      <w:r>
+        <w:rPr>
+          <w:rFonts w:ascii="Times New Roman" w:hAnsi="Times New Roman"/>
+          <w:sz w:val="24"/>
+        </w:rPr>
+        <w:t>Users select a home zone during onboarding and see only products available within that zone.</w:t>
+      </w:r>
+    </w:p>
+    <w:p>
+      <w:pPr>
+        <w:pStyle w:val="ListParagraph"/>
+        <w:numPr>
+          <w:ilvl w:val="0"/>
+          <w:numId w:val="8"/>
+        </w:numPr>
+      </w:pPr>
+      <w:r>
+        <w:rPr>
+          <w:rFonts w:ascii="Times New Roman" w:hAnsi="Times New Roman"/>
+          <w:sz w:val="24"/>
+        </w:rPr>
+        <w:t>Administrators manage zone definitions and boundaries.</w:t>
+      </w:r>
+    </w:p>
+    <w:p>
+      <w:pPr>
+        <w:pStyle w:val="ListParagraph"/>
+        <w:numPr>
+          <w:ilvl w:val="0"/>
+          <w:numId w:val="8"/>
+        </w:numPr>
+      </w:pPr>
+      <w:r>
+        <w:rPr>
+          <w:rFonts w:ascii="Times New Roman" w:hAnsi="Times New Roman"/>
+          <w:sz w:val="24"/>
+        </w:rPr>
+        <w:t>Every product listing is explicitly tied to the zone it is sold in.</w:t>
+      </w:r>
+    </w:p>
+    <w:p>
+      <w:r>
+        <w:rPr>
+          <w:rFonts w:ascii="Times New Roman" w:hAnsi="Times New Roman"/>
+          <w:b/>
+          <w:sz w:val="24"/>
+        </w:rPr>
+        <w:t>Merchant Registration and Verification (FR-10–FR-13)</w:t>
+      </w:r>
+    </w:p>
+    <w:p>
+      <w:pPr>
+        <w:pStyle w:val="ListParagraph"/>
+        <w:numPr>
+          <w:ilvl w:val="0"/>
+          <w:numId w:val="8"/>
+        </w:numPr>
+      </w:pPr>
+      <w:r>
+        <w:rPr>
+          <w:rFonts w:ascii="Times New Roman" w:hAnsi="Times New Roman"/>
+          <w:sz w:val="24"/>
+        </w:rPr>
+        <w:t>Merchants register and submit business credentials for verification.</w:t>
+      </w:r>
+    </w:p>
+    <w:p>
+      <w:pPr>
+        <w:pStyle w:val="ListParagraph"/>
+        <w:numPr>
+          <w:ilvl w:val="0"/>
+          <w:numId w:val="8"/>
+        </w:numPr>
+      </w:pPr>
+      <w:r>
+        <w:rPr>
+          <w:rFonts w:ascii="Times New Roman" w:hAnsi="Times New Roman"/>
+          <w:sz w:val="24"/>
+        </w:rPr>
+        <w:t>Administrators approve or reject merchant applications.</w:t>
+      </w:r>
+    </w:p>
+    <w:p>
+      <w:pPr>
+        <w:pStyle w:val="ListParagraph"/>
+        <w:numPr>
+          <w:ilvl w:val="0"/>
+          <w:numId w:val="8"/>
+        </w:numPr>
+      </w:pPr>
+      <w:r>
+        <w:rPr>
+          <w:rFonts w:ascii="Times New Roman" w:hAnsi="Times New Roman"/>
+          <w:sz w:val="24"/>
+        </w:rPr>
+        <w:t>Approved merchants receive scoped access to listing and inventory tools.</w:t>
+      </w:r>
+    </w:p>
+    <w:p>
+      <w:r>
+        <w:rPr>
+          <w:rFonts w:ascii="Times New Roman" w:hAnsi="Times New Roman"/>
+          <w:b/>
+          <w:sz w:val="24"/>
+        </w:rPr>
+        <w:t>Product Listing and Inventory (FR-14–FR-18)</w:t>
+      </w:r>
+    </w:p>
+    <w:p>
+      <w:pPr>
+        <w:pStyle w:val="ListParagraph"/>
+        <w:numPr>
+          <w:ilvl w:val="0"/>
+          <w:numId w:val="8"/>
+        </w:numPr>
+      </w:pPr>
+      <w:r>
+        <w:rPr>
+          <w:rFonts w:ascii="Times New Roman" w:hAnsi="Times New Roman"/>
+          <w:sz w:val="24"/>
+        </w:rPr>
+        <w:t>Merchants list surplus products with a mandatory expiry-date photograph and expiry metadata.</w:t>
+      </w:r>
+    </w:p>
+    <w:p>
+      <w:pPr>
+        <w:pStyle w:val="ListParagraph"/>
+        <w:numPr>
+          <w:ilvl w:val="0"/>
+          <w:numId w:val="8"/>
+        </w:numPr>
+      </w:pPr>
+      <w:r>
+        <w:rPr>
+          <w:rFonts w:ascii="Times New Roman" w:hAnsi="Times New Roman"/>
+          <w:sz w:val="24"/>
+        </w:rPr>
+        <w:t>Every listing goes through a review step before it becomes visible to customers.</w:t>
+      </w:r>
+    </w:p>
+    <w:p>
+      <w:pPr>
+        <w:pStyle w:val="ListParagraph"/>
+        <w:numPr>
+          <w:ilvl w:val="0"/>
+          <w:numId w:val="8"/>
+        </w:numPr>
+      </w:pPr>
+      <w:r>
+        <w:rPr>
+          <w:rFonts w:ascii="Times New Roman" w:hAnsi="Times New Roman"/>
+          <w:sz w:val="24"/>
+        </w:rPr>
+        <w:t>Inventory quantities are tracked per listing as stock is sold or reserved.</w:t>
+      </w:r>
+    </w:p>
+    <w:p>
+      <w:r>
+        <w:rPr>
+          <w:rFonts w:ascii="Times New Roman" w:hAnsi="Times New Roman"/>
+          <w:b/>
+          <w:sz w:val="24"/>
+        </w:rPr>
+        <w:t>Expiry Management (FR-19–FR-22)</w:t>
+      </w:r>
+    </w:p>
+    <w:p>
+      <w:pPr>
+        <w:pStyle w:val="ListParagraph"/>
+        <w:numPr>
+          <w:ilvl w:val="0"/>
+          <w:numId w:val="8"/>
+        </w:numPr>
+      </w:pPr>
+      <w:r>
+        <w:rPr>
+          <w:rFonts w:ascii="Times New Roman" w:hAnsi="Times New Roman"/>
+          <w:sz w:val="24"/>
+        </w:rPr>
+        <w:t>The system continuously monitors listings for approaching expiry.</w:t>
+      </w:r>
+    </w:p>
+    <w:p>
+      <w:pPr>
+        <w:pStyle w:val="ListParagraph"/>
+        <w:numPr>
+          <w:ilvl w:val="0"/>
+          <w:numId w:val="8"/>
+        </w:numPr>
+      </w:pPr>
+      <w:r>
+        <w:rPr>
+          <w:rFonts w:ascii="Times New Roman" w:hAnsi="Times New Roman"/>
+          <w:sz w:val="24"/>
+        </w:rPr>
+        <w:t>Listings are automatically removed a configured number of days before expiry, with the removal logged.</w:t>
+      </w:r>
+    </w:p>
+    <w:p>
+      <w:pPr>
+        <w:pStyle w:val="ListParagraph"/>
+        <w:numPr>
+          <w:ilvl w:val="0"/>
+          <w:numId w:val="8"/>
+        </w:numPr>
+      </w:pPr>
+      <w:r>
+        <w:rPr>
+          <w:rFonts w:ascii="Times New Roman" w:hAnsi="Times New Roman"/>
+          <w:sz w:val="24"/>
+        </w:rPr>
+        <w:t>Merchants are notified as their listings approach expiry.</w:t>
+      </w:r>
+    </w:p>
+    <w:p>
+      <w:r>
+        <w:rPr>
+          <w:rFonts w:ascii="Times New Roman" w:hAnsi="Times New Roman"/>
+          <w:b/>
+          <w:sz w:val="24"/>
+        </w:rPr>
+        <w:t>Pricing and Discount Management (FR-23–FR-28)</w:t>
+      </w:r>
+    </w:p>
+    <w:p>
+      <w:pPr>
+        <w:pStyle w:val="ListParagraph"/>
+        <w:numPr>
+          <w:ilvl w:val="0"/>
+          <w:numId w:val="8"/>
+        </w:numPr>
+      </w:pPr>
+      <w:r>
+        <w:rPr>
+          <w:rFonts w:ascii="Times New Roman" w:hAnsi="Times New Roman"/>
+          <w:sz w:val="24"/>
+        </w:rPr>
+        <w:t>Prices are benchmarked against a market-price reference and discounted within a system-controlled range — merchants cannot set arbitrary prices.</w:t>
+      </w:r>
+    </w:p>
+    <w:p>
+      <w:pPr>
+        <w:pStyle w:val="ListParagraph"/>
+        <w:numPr>
+          <w:ilvl w:val="0"/>
+          <w:numId w:val="8"/>
+        </w:numPr>
+      </w:pPr>
+      <w:r>
+        <w:rPr>
+          <w:rFonts w:ascii="Times New Roman" w:hAnsi="Times New Roman"/>
+          <w:sz w:val="24"/>
+        </w:rPr>
+        <w:t>Merchants can bundle multiple surplus items into "food bundles" with bundle-level pricing.</w:t>
+      </w:r>
+    </w:p>
+    <w:p>
+      <w:r>
+        <w:rPr>
+          <w:rFonts w:ascii="Times New Roman" w:hAnsi="Times New Roman"/>
+          <w:b/>
+          <w:sz w:val="24"/>
+        </w:rPr>
+        <w:t>Product Discovery and Purchase (FR-29–FR-35)</w:t>
+      </w:r>
+    </w:p>
+    <w:p>
+      <w:pPr>
+        <w:pStyle w:val="ListParagraph"/>
+        <w:numPr>
+          <w:ilvl w:val="0"/>
+          <w:numId w:val="8"/>
+        </w:numPr>
+      </w:pPr>
+      <w:r>
+        <w:rPr>
+          <w:rFonts w:ascii="Times New Roman" w:hAnsi="Times New Roman"/>
+          <w:sz w:val="24"/>
+        </w:rPr>
+        <w:t>Customers browse, search and filter listings within their zone and view full product details.</w:t>
+      </w:r>
+    </w:p>
+    <w:p>
+      <w:pPr>
+        <w:pStyle w:val="ListParagraph"/>
+        <w:numPr>
+          <w:ilvl w:val="0"/>
+          <w:numId w:val="8"/>
+        </w:numPr>
+      </w:pPr>
+      <w:r>
+        <w:rPr>
+          <w:rFonts w:ascii="Times New Roman" w:hAnsi="Times New Roman"/>
+          <w:sz w:val="24"/>
+        </w:rPr>
+        <w:t>Adding an item to cart places a short-lived inventory reservation to prevent overselling.</w:t>
+      </w:r>
+    </w:p>
+    <w:p>
+      <w:pPr>
+        <w:pStyle w:val="ListParagraph"/>
+        <w:numPr>
+          <w:ilvl w:val="0"/>
+          <w:numId w:val="8"/>
+        </w:numPr>
+      </w:pPr>
+      <w:r>
+        <w:rPr>
+          <w:rFonts w:ascii="Times New Roman" w:hAnsi="Times New Roman"/>
+          <w:sz w:val="24"/>
+        </w:rPr>
+        <w:t>Per-user purchase limits are enforced and monitored to discourage hoarding.</w:t>
+      </w:r>
+    </w:p>
+    <w:p>
+      <w:r>
+        <w:rPr>
+          <w:rFonts w:ascii="Times New Roman" w:hAnsi="Times New Roman"/>
+          <w:b/>
+          <w:sz w:val="24"/>
+        </w:rPr>
+        <w:t>Donation (FR-36–FR-41)</w:t>
+      </w:r>
+    </w:p>
+    <w:p>
+      <w:pPr>
+        <w:pStyle w:val="ListParagraph"/>
+        <w:numPr>
+          <w:ilvl w:val="0"/>
+          <w:numId w:val="8"/>
+        </w:numPr>
+      </w:pPr>
+      <w:r>
+        <w:rPr>
+          <w:rFonts w:ascii="Times New Roman" w:hAnsi="Times New Roman"/>
+          <w:sz w:val="24"/>
+        </w:rPr>
+        <w:t>Both individual users and merchants can donate eligible products instead of selling them.</w:t>
+      </w:r>
+    </w:p>
+    <w:p>
+      <w:pPr>
+        <w:pStyle w:val="ListParagraph"/>
+        <w:numPr>
+          <w:ilvl w:val="0"/>
+          <w:numId w:val="8"/>
+        </w:numPr>
+      </w:pPr>
+      <w:r>
+        <w:rPr>
+          <w:rFonts w:ascii="Times New Roman" w:hAnsi="Times New Roman"/>
+          <w:sz w:val="24"/>
+        </w:rPr>
+        <w:t>Donated items are checked against eligibility rules before acceptance.</w:t>
+      </w:r>
+    </w:p>
+    <w:p>
+      <w:pPr>
+        <w:pStyle w:val="ListParagraph"/>
+        <w:numPr>
+          <w:ilvl w:val="0"/>
+          <w:numId w:val="8"/>
+        </w:numPr>
+      </w:pPr>
+      <w:r>
+        <w:rPr>
+          <w:rFonts w:ascii="Times New Roman" w:hAnsi="Times New Roman"/>
+          <w:sz w:val="24"/>
+        </w:rPr>
+        <w:t>Eligible donations are allocated to verified NGOs or recipients, with full custody tracking end to end.</w:t>
+      </w:r>
+    </w:p>
+    <w:p>
+      <w:r>
+        <w:rPr>
+          <w:rFonts w:ascii="Times New Roman" w:hAnsi="Times New Roman"/>
+          <w:b/>
+          <w:sz w:val="24"/>
+        </w:rPr>
+        <w:t>Pickup and Delivery (FR-42–FR-47)</w:t>
+      </w:r>
+    </w:p>
+    <w:p>
+      <w:pPr>
+        <w:pStyle w:val="ListParagraph"/>
+        <w:numPr>
+          <w:ilvl w:val="0"/>
+          <w:numId w:val="8"/>
+        </w:numPr>
+      </w:pPr>
+      <w:r>
+        <w:rPr>
+          <w:rFonts w:ascii="Times New Roman" w:hAnsi="Times New Roman"/>
+          <w:sz w:val="24"/>
+        </w:rPr>
+        <w:t>Customers choose pickup or delivery at checkout, with pickup location and time details shown.</w:t>
+      </w:r>
+    </w:p>
+    <w:p>
+      <w:pPr>
+        <w:pStyle w:val="ListParagraph"/>
+        <w:numPr>
+          <w:ilvl w:val="0"/>
+          <w:numId w:val="8"/>
+        </w:numPr>
+      </w:pPr>
+      <w:r>
+        <w:rPr>
+          <w:rFonts w:ascii="Times New Roman" w:hAnsi="Times New Roman"/>
+          <w:sz w:val="24"/>
+        </w:rPr>
+        <w:t>Delivery orders are assigned to a delivery employee and tracked through to completion, with no separate delivery fee charged to the customer.</w:t>
+      </w:r>
+    </w:p>
+    <w:p>
+      <w:r>
+        <w:rPr>
+          <w:rFonts w:ascii="Times New Roman" w:hAnsi="Times New Roman"/>
+          <w:b/>
+          <w:sz w:val="24"/>
+        </w:rPr>
+        <w:t>Payment (FR-48–FR-54)</w:t>
+      </w:r>
+    </w:p>
+    <w:p>
+      <w:pPr>
+        <w:pStyle w:val="ListParagraph"/>
+        <w:numPr>
+          <w:ilvl w:val="0"/>
+          <w:numId w:val="8"/>
+        </w:numPr>
+      </w:pPr>
+      <w:r>
+        <w:rPr>
+          <w:rFonts w:ascii="Times New Roman" w:hAnsi="Times New Roman"/>
+          <w:sz w:val="24"/>
+        </w:rPr>
+        <w:t>Customers pay digitally through supported methods (e.g. bKash/Nagad), with payment confirmed and recorded as a transaction.</w:t>
+      </w:r>
+    </w:p>
+    <w:p>
+      <w:pPr>
+        <w:pStyle w:val="ListParagraph"/>
+        <w:numPr>
+          <w:ilvl w:val="0"/>
+          <w:numId w:val="8"/>
+        </w:numPr>
+      </w:pPr>
+      <w:r>
+        <w:rPr>
+          <w:rFonts w:ascii="Times New Roman" w:hAnsi="Times New Roman"/>
+          <w:sz w:val="24"/>
+        </w:rPr>
+        <w:t>Failed payments and refunds are handled explicitly, and customers are never charged beyond the product/order price.</w:t>
+      </w:r>
+    </w:p>
+    <w:p>
+      <w:r>
+        <w:rPr>
+          <w:rFonts w:ascii="Times New Roman" w:hAnsi="Times New Roman"/>
+          <w:b/>
+          <w:sz w:val="24"/>
+        </w:rPr>
+        <w:t>Advertising and Revenue (FR-55–FR-60)</w:t>
+      </w:r>
+    </w:p>
+    <w:p>
+      <w:pPr>
+        <w:pStyle w:val="ListParagraph"/>
+        <w:numPr>
+          <w:ilvl w:val="0"/>
+          <w:numId w:val="8"/>
+        </w:numPr>
+      </w:pPr>
+      <w:r>
+        <w:rPr>
+          <w:rFonts w:ascii="Times New Roman" w:hAnsi="Times New Roman"/>
+          <w:sz w:val="24"/>
+        </w:rPr>
+        <w:t>NGOs and organizations register and are verified before they can advertise on the platform.</w:t>
+      </w:r>
+    </w:p>
+    <w:p>
+      <w:pPr>
+        <w:pStyle w:val="ListParagraph"/>
+        <w:numPr>
+          <w:ilvl w:val="0"/>
+          <w:numId w:val="8"/>
+        </w:numPr>
+      </w:pPr>
+      <w:r>
+        <w:rPr>
+          <w:rFonts w:ascii="Times New Roman" w:hAnsi="Times New Roman"/>
+          <w:sz w:val="24"/>
+        </w:rPr>
+        <w:t>Verified advertisers submit campaigns for administrator approval and manage them within an approved window.</w:t>
+      </w:r>
+    </w:p>
+    <w:p>
+      <w:pPr>
+        <w:pStyle w:val="ListParagraph"/>
+        <w:numPr>
+          <w:ilvl w:val="0"/>
+          <w:numId w:val="8"/>
+        </w:numPr>
+      </w:pPr>
+      <w:r>
+        <w:rPr>
+          <w:rFonts w:ascii="Times New Roman" w:hAnsi="Times New Roman"/>
+          <w:sz w:val="24"/>
+        </w:rPr>
+        <w:t>Advertising activity is recorded as the platform's primary revenue stream.</w:t>
+      </w:r>
+    </w:p>
+    <w:p>
+      <w:r>
+        <w:rPr>
+          <w:rFonts w:ascii="Times New Roman" w:hAnsi="Times New Roman"/>
+          <w:b/>
+          <w:sz w:val="24"/>
+        </w:rPr>
+        <w:t>Complaints and Customer Support (FR-61–FR-63)</w:t>
+      </w:r>
+    </w:p>
+    <w:p>
+      <w:pPr>
+        <w:pStyle w:val="ListParagraph"/>
+        <w:numPr>
+          <w:ilvl w:val="0"/>
+          <w:numId w:val="8"/>
+        </w:numPr>
+      </w:pPr>
+      <w:r>
+        <w:rPr>
+          <w:rFonts w:ascii="Times New Roman" w:hAnsi="Times New Roman"/>
+          <w:sz w:val="24"/>
+        </w:rPr>
+        <w:t>Users can submit complaints about orders, listings, or service issues.</w:t>
+      </w:r>
+    </w:p>
+    <w:p>
+      <w:pPr>
+        <w:pStyle w:val="ListParagraph"/>
+        <w:numPr>
+          <w:ilvl w:val="0"/>
+          <w:numId w:val="8"/>
+        </w:numPr>
+      </w:pPr>
+      <w:r>
+        <w:rPr>
+          <w:rFonts w:ascii="Times New Roman" w:hAnsi="Times New Roman"/>
+          <w:sz w:val="24"/>
+        </w:rPr>
+        <w:t>Administrators triage and manage complaints through to resolution, with status visible to the user who raised it.</w:t>
+      </w:r>
+    </w:p>
+    <w:p>
+      <w:r>
+        <w:rPr>
+          <w:rFonts w:ascii="Times New Roman" w:hAnsi="Times New Roman"/>
+          <w:b/>
+          <w:sz w:val="24"/>
+        </w:rPr>
+        <w:t>Administration and Monitoring (FR-64–FR-70)</w:t>
+      </w:r>
+    </w:p>
+    <w:p>
+      <w:pPr>
+        <w:pStyle w:val="ListParagraph"/>
+        <w:numPr>
+          <w:ilvl w:val="0"/>
+          <w:numId w:val="8"/>
+        </w:numPr>
+      </w:pPr>
+      <w:r>
+        <w:rPr>
+          <w:rFonts w:ascii="Times New Roman" w:hAnsi="Times New Roman"/>
+          <w:sz w:val="24"/>
+        </w:rPr>
+        <w:t>Administrators manage users, merchants, and product moderation from a central console.</w:t>
+      </w:r>
+    </w:p>
+    <w:p>
+      <w:pPr>
+        <w:pStyle w:val="ListParagraph"/>
+        <w:numPr>
+          <w:ilvl w:val="0"/>
+          <w:numId w:val="8"/>
+        </w:numPr>
+      </w:pPr>
+      <w:r>
+        <w:rPr>
+          <w:rFonts w:ascii="Times New Roman" w:hAnsi="Times New Roman"/>
+          <w:sz w:val="24"/>
+        </w:rPr>
+        <w:t>Payment activity and payment-gateway health are monitored.</w:t>
+      </w:r>
+    </w:p>
+    <w:p>
+      <w:pPr>
+        <w:pStyle w:val="ListParagraph"/>
+        <w:numPr>
+          <w:ilvl w:val="0"/>
+          <w:numId w:val="8"/>
+        </w:numPr>
+      </w:pPr>
+      <w:r>
+        <w:rPr>
+          <w:rFonts w:ascii="Times New Roman" w:hAnsi="Times New Roman"/>
+          <w:sz w:val="24"/>
+        </w:rPr>
+        <w:t>Delivery operations are managed and reporting is available across the platform.</w:t>
+      </w:r>
+    </w:p>
+    <w:p>
+      <w:r>
+        <w:rPr>
+          <w:rFonts w:ascii="Times New Roman" w:hAnsi="Times New Roman"/>
+          <w:b/>
+          <w:sz w:val="24"/>
+        </w:rPr>
+        <w:t>Notifications (FR-71–FR-73)</w:t>
+      </w:r>
+    </w:p>
+    <w:p>
+      <w:pPr>
+        <w:pStyle w:val="ListParagraph"/>
+        <w:numPr>
+          <w:ilvl w:val="0"/>
+          <w:numId w:val="8"/>
+        </w:numPr>
+      </w:pPr>
+      <w:r>
+        <w:rPr>
+          <w:rFonts w:ascii="Times New Roman" w:hAnsi="Times New Roman"/>
+          <w:sz w:val="24"/>
+        </w:rPr>
+        <w:t>Users receive notifications for account, order, and expiry-related events.</w:t>
       </w:r>
     </w:p>
     <w:p>

</xml_diff>

<commit_message>
Update Shashroy Bazar final report and add PDF version
</commit_message>
<xml_diff>
--- a/Project/Shashroy_Bazar_Final_Report.docx
+++ b/Project/Shashroy_Bazar_Final_Report.docx
@@ -6535,6 +6535,9 @@
     <w:p/>
     <w:p/>
     <w:p>
+      <w:pPr>
+        <w:pageBreakBefore/>
+      </w:pPr>
       <w:r>
         <w:rPr>
           <w:rFonts w:ascii="Times New Roman" w:hAnsi="Times New Roman"/>
@@ -6548,7 +6551,7 @@
       <w:r>
         <w:drawing>
           <wp:inline xmlns:a="http://schemas.openxmlformats.org/drawingml/2006/main" xmlns:pic="http://schemas.openxmlformats.org/drawingml/2006/picture">
-            <wp:extent cx="5943600" cy="9437716"/>
+            <wp:extent cx="4952418" cy="7863840"/>
             <wp:docPr id="1147" name="Picture 1147"/>
             <wp:cNvGraphicFramePr>
               <a:graphicFrameLocks noChangeAspect="1"/>
@@ -6569,7 +6572,7 @@
                   <pic:spPr>
                     <a:xfrm>
                       <a:off x="0" y="0"/>
-                      <a:ext cx="5943600" cy="9437716"/>
+                      <a:ext cx="4952418" cy="7863840"/>
                     </a:xfrm>
                     <a:prstGeom prst="rect"/>
                   </pic:spPr>

</xml_diff>